<commit_message>
Strengthen resume evidence and improve bilingual portfolio navigation
</commit_message>
<xml_diff>
--- a/assets/resumes/data-analysis.docx
+++ b/assets/resumes/data-analysis.docx
@@ -97,33 +97,63 @@
           <w:p>
             <w:pPr>
               <w:pStyle w:val="ResumeContact"/>
+              <w:spacing w:after="0"/>
             </w:pPr>
+            <w:r/>
+            <w:hyperlink r:id="rId13">
+              <w:r>
+                <w:rPr>
+                  <w:color w:val="245483"/>
+                  <w:u w:val="single"/>
+                  <w:sz w:val="18"/>
+                </w:rPr>
+                <w:t>2903442978@qq.com</w:t>
+              </w:r>
+            </w:hyperlink>
+            <w:r>
+              <w:rPr>
+                <w:sz w:val="18"/>
+              </w:rPr>
+              <w:t xml:space="preserve"> | </w:t>
+            </w:r>
             <w:hyperlink r:id="rId7">
               <w:r>
                 <w:rPr>
-                  <w:rStyle w:val="a4"/>
+                  <w:color w:val="245483"/>
+                  <w:u w:val="single"/>
+                  <w:sz w:val="18"/>
                 </w:rPr>
                 <w:t>chujunjie0908@gmail.com</w:t>
               </w:r>
             </w:hyperlink>
             <w:r>
-              <w:t xml:space="preserve">  |  </w:t>
+              <w:rPr>
+                <w:sz w:val="18"/>
+              </w:rPr>
+              <w:t xml:space="preserve"> | </w:t>
             </w:r>
             <w:hyperlink r:id="rId8">
               <w:r>
                 <w:rPr>
-                  <w:rStyle w:val="a4"/>
+                  <w:color w:val="245483"/>
+                  <w:u w:val="single"/>
+                  <w:sz w:val="18"/>
                 </w:rPr>
                 <w:t>GitHub</w:t>
               </w:r>
             </w:hyperlink>
             <w:r>
-              <w:t xml:space="preserve">  |  </w:t>
+              <w:rPr>
+                <w:sz w:val="18"/>
+              </w:rPr>
+              <w:t xml:space="preserve"> | </w:t>
             </w:r>
             <w:hyperlink r:id="rId9">
               <w:r>
                 <w:rPr>
-                  <w:rStyle w:val="a4"/>
+                  <w:color w:val="245483"/>
+                  <w:u w:val="single"/>
+                  <w:sz w:val="18"/>
                 </w:rPr>
                 <w:t>个人主页</w:t>
               </w:r>
@@ -304,6 +334,9 @@
         <w:pStyle w:val="ResumeBullet"/>
       </w:pPr>
       <w:r>
+        <w:rPr>
+          <w:b w:val="0"/>
+        </w:rPr>
         <w:t xml:space="preserve">依据官方资料更新20款海外大模型对比表，统一整理版本、上下文、多模态、API价格与开源情况，标明资料来源，为团队技术选型提供依据。</w:t>
       </w:r>
     </w:p>
@@ -329,6 +362,9 @@
         <w:pStyle w:val="ResumeBullet"/>
       </w:pPr>
       <w:r>
+        <w:rPr>
+          <w:b w:val="0"/>
+        </w:rPr>
         <w:t xml:space="preserve">汇总人脸连接器54项内部测试记录，分类标注场景及验证状态，统计端到端耗时分位数。</w:t>
       </w:r>
     </w:p>
@@ -362,6 +398,9 @@
         <w:pStyle w:val="ResumeBullet"/>
       </w:pPr>
       <w:r>
+        <w:rPr>
+          <w:b w:val="0"/>
+        </w:rPr>
         <w:t xml:space="preserve">以Excel维护3场展会的双阶段付款和参展商记录，整理分类供应商清单；独立完成中国区建材展会调研，输出结构化信息供业务筛选。</w:t>
       </w:r>
     </w:p>
@@ -384,26 +423,35 @@
         <w:rPr>
           <w:b w:val="1"/>
         </w:rPr>
-        <w:t xml:space="preserve">FlyHigh 航空数据库设计与SQL分析</w:t>
-      </w:r>
-      <w:r>
-        <w:rPr>
-          <w:color w:val="555555"/>
+        <w:t>关系数据库设计与SQL分析</w:t>
+      </w:r>
+      <w:r>
+        <w:rPr>
+          <w:b w:val="0"/>
+          <w:color w:val="595959"/>
           <w:sz w:val="19"/>
-          <w:szCs w:val="19"/>
+        </w:rPr>
+        <w:tab/>
+        <w:t>2025.06–2025.09</w:t>
+      </w:r>
+    </w:p>
+    <w:p>
+      <w:pPr>
+        <w:pStyle w:val="ResumeMeta"/>
+      </w:pPr>
+      <w:r>
+        <w:t xml:space="preserve">个人项目｜SQL / MySQL Workbench / ER/EER / 3NF</w:t>
+      </w:r>
+    </w:p>
+    <w:p>
+      <w:pPr>
+        <w:pStyle w:val="ResumeBullet"/>
+      </w:pPr>
+      <w:r>
+        <w:rPr>
           <w:b w:val="0"/>
         </w:rPr>
-        <w:t xml:space="preserve"/>
-        <w:tab/>
-        <w:t xml:space="preserve">2025.06–2025.09</w:t>
-      </w:r>
-    </w:p>
-    <w:p>
-      <w:pPr>
-        <w:pStyle w:val="ResumeMeta"/>
-      </w:pPr>
-      <w:r>
-        <w:t xml:space="preserve">个人项目｜SQL / MySQL Workbench / ER/EER / 3NF</w:t>
+        <w:t>FlyHigh课程设计：围绕机队、订票、员工、财务和资源5个业务域，独立设计22实体ER/EER模型；定义主外键与关系基数，按3NF检查传递依赖。</w:t>
       </w:r>
     </w:p>
     <w:p>
@@ -411,15 +459,10 @@
         <w:pStyle w:val="ResumeBullet"/>
       </w:pPr>
       <w:r>
-        <w:t xml:space="preserve">围绕机队、订票、员工、财务和资源5个业务域，独立设计22实体ER/EER模型，定义主外键及关系基数；按3NF检查并消除传递依赖。</w:t>
-      </w:r>
-    </w:p>
-    <w:p>
-      <w:pPr>
-        <w:pStyle w:val="ResumeBullet"/>
-      </w:pPr>
-      <w:r>
-        <w:t xml:space="preserve">使用MySQL Workbench完成建库与数据准备，编写多表JOIN和GROUP BY聚合查询；输出查询结果并解释业务关系，验证表结构可支持检索与汇总。</w:t>
+        <w:rPr>
+          <w:b w:val="0"/>
+        </w:rPr>
+        <w:t>图书馆SQL课程实践：以JOIN、分组和HAVING识别最常借阅书目（5236，12次）；筛选借阅≥3次读者，统计已归还记录的平均时长（2–7天），提供资源配置分析线索。</w:t>
       </w:r>
     </w:p>
     <w:p>
@@ -441,7 +484,7 @@
         <w:pStyle w:val="ResumeMeta"/>
       </w:pPr>
       <w:r>
-        <w:t xml:space="preserve">个人课程项目｜Weka / EDA / K-means / MLP / 10折交叉验证</w:t>
+        <w:t>个人课程项目｜Weka / EDA / K-means / DL4J MLP / 10折交叉验证</w:t>
       </w:r>
     </w:p>
     <w:p>
@@ -449,7 +492,10 @@
         <w:pStyle w:val="ResumeBullet"/>
       </w:pPr>
       <w:r>
-        <w:t xml:space="preserve">对3,630条记录、36项特征完成编码字段处理、EDA与K-means聚类，分析在校阶段辍学关联因素。</w:t>
+        <w:rPr>
+          <w:b w:val="0"/>
+        </w:rPr>
+        <w:t>分析3,630条记录、36项特征；第二学期通过课程数区分辍学与毕业，且为J48根节点；结论限定为在校关联，避免因果或入学前预测解释。</w:t>
       </w:r>
     </w:p>
     <w:p>
@@ -457,7 +503,10 @@
         <w:pStyle w:val="ResumeBullet"/>
       </w:pPr>
       <w:r>
-        <w:t xml:space="preserve">使用10折交叉验证比较J48、Naive Bayes、IBk和MLP；调优后加权F1为0.893、ROC-AUC为0.933、辍学召回率为0.825，结合类别指标评估预测表现。</w:t>
+        <w:rPr>
+          <w:b w:val="0"/>
+        </w:rPr>
+        <w:t>DL4J MLP经10折验证加权F1为0.893、ROC-AUC为0.933；检出1,172/1,421例辍学（召回0.825），仍漏判249例，据此评估漏报而非只看准确率。</w:t>
       </w:r>
     </w:p>
     <w:p>
@@ -470,7 +519,7 @@
     </w:p>
     <w:p>
       <w:r>
-        <w:t xml:space="preserve">数据工具：SQL（多表关联、聚合、CTE、窗口函数）、MySQL Workbench、Python、pandas、Excel</w:t>
+        <w:t>工具：SQL（JOIN、GROUP BY、HAVING、日期计算）、MySQL Workbench、Python、pandas、Excel</w:t>
       </w:r>
     </w:p>
     <w:p>
@@ -970,7 +1019,7 @@
     <w:name w:val="Normal"/>
     <w:qFormat/>
     <w:pPr>
-      <w:spacing w:after="37" w:line="355" w:lineRule="exact"/>
+      <w:spacing w:after="25" w:line="355" w:lineRule="exact"/>
     </w:pPr>
   </w:style>
   <w:style w:type="paragraph" w:styleId="1">
@@ -985,7 +1034,7 @@
       <w:pBdr>
         <w:bottom w:val="single" w:sz="6" w:space="2" w:color="1F4E79"/>
       </w:pBdr>
-      <w:spacing w:before="208" w:after="86" w:line="392" w:lineRule="exact"/>
+      <w:spacing w:before="140" w:after="70" w:line="392" w:lineRule="exact"/>
       <w:outlineLvl w:val="0"/>
     </w:pPr>
     <w:rPr>
@@ -1070,7 +1119,7 @@
     <w:pPr>
       <w:keepNext/>
       <w:keepLines/>
-      <w:spacing w:before="86" w:after="18" w:line="361" w:lineRule="exact"/>
+      <w:spacing w:before="60" w:after="18" w:line="361" w:lineRule="exact"/>
     </w:pPr>
     <w:rPr>
       <w:b/>
@@ -1098,7 +1147,7 @@
       <w:numPr>
         <w:numId w:val="1"/>
       </w:numPr>
-      <w:spacing w:after="43"/>
+      <w:spacing w:after="30"/>
     </w:pPr>
   </w:style>
   <w:style w:type="character" w:styleId="a4">

</xml_diff>